<commit_message>
Report the lens refractive index and scope the conclusions to it
The lens material was never stated anywhere in the manuscript or supplement.
It is N-BK7 (n = 1.517 at 589 nm), index-matched to the 1.51 substrate and
held fixed across every campaign and family, which the simulation sources
confirm. Added to Table S1 and to Methods 4.2 in both manuscripts, together
with the consequence that follows: the outcoupling layer's index is a platform
parameter here rather than a design variable, so the saturation conclusions
hold at substrate-matched index only. This closes a reporting gap a reviewer
would find on their own, and delimits this work against a study varying index.

Co-Authored-By: Claude Opus 5 <noreply@anthropic.com>
Claude-Session: https://claude.ai/code/session_01YWogpr6EEdWobKwLNCqjUn
</commit_message>
<xml_diff>
--- a/Manuscript_EN.docx
+++ b/Manuscript_EN.docx
@@ -3416,7 +3416,35 @@
         <w:rPr>
           <w:rFonts w:ascii="Cambria" w:cs="Cambria" w:eastAsia="Cambria" w:hAnsi="Cambria"/>
         </w:rPr>
-        <w:t xml:space="preserve">The hemispherical reference and the axisymmetric freeform class were compared under one set of constraints: identical lens material, pitch, fill factor, nominal height, boundary continuity, and maximum draft angle. Lenslets of approximately 10 μm radius are tiled hexagonally over a 25 × 25 mm area on the substrate exit face; the adequacy of this patch size, and the saturating-exponential dependence of total EQE on it, are quantified in Supplementary Table S7. The axisymmetric freeform surface is parameterized by 13 design variables (spline control points, with the radial control points </w:t>
+        <w:t xml:space="preserve">The hemispherical reference and the axisymmetric freeform class were compared under one set of constraints: identical lens material, pitch, fill factor, nominal height, boundary continuity, and maximum draft angle. The lens material is N-BK7 (</w:t>
+      </w:r>
+      <w:r>
+        <w:rPr>
+          <w:rFonts w:ascii="Cambria" w:cs="Cambria" w:eastAsia="Cambria" w:hAnsi="Cambria"/>
+          <w:i/>
+          <w:iCs/>
+        </w:rPr>
+        <w:t xml:space="preserve">n = 1.517</w:t>
+      </w:r>
+      <w:r>
+        <w:rPr>
+          <w:rFonts w:ascii="Cambria" w:cs="Cambria" w:eastAsia="Cambria" w:hAnsi="Cambria"/>
+        </w:rPr>
+        <w:t xml:space="preserve"> at 589 nm), index-matched to the substrate (</w:t>
+      </w:r>
+      <w:r>
+        <w:rPr>
+          <w:rFonts w:ascii="Cambria" w:cs="Cambria" w:eastAsia="Cambria" w:hAnsi="Cambria"/>
+          <w:i/>
+          <w:iCs/>
+        </w:rPr>
+        <w:t xml:space="preserve">n = 1.51</w:t>
+      </w:r>
+      <w:r>
+        <w:rPr>
+          <w:rFonts w:ascii="Cambria" w:cs="Cambria" w:eastAsia="Cambria" w:hAnsi="Cambria"/>
+        </w:rPr>
+        <w:t xml:space="preserve">) so that no interface loss is introduced between substrate and film and the film/air boundary alone sets the escape condition. This index is held fixed in every campaign and every family; the refractive index of the outcoupling layer is therefore a parameter of the platform in this work, not one of its design variables, and conclusions here are drawn at substrate-matched index only. Lenslets of approximately 10 μm radius are tiled hexagonally over a 25 × 25 mm area on the substrate exit face; the adequacy of this patch size, and the saturating-exponential dependence of total EQE on it, are quantified in Supplementary Table S7. The axisymmetric freeform surface is parameterized by 13 design variables (spline control points, with the radial control points </w:t>
       </w:r>
       <w:r>
         <w:rPr>

</xml_diff>